<commit_message>
Initial project setup for Kwa Olga website
</commit_message>
<xml_diff>
--- a/docs/KWA OLGA WEBSITE outline.docx
+++ b/docs/KWA OLGA WEBSITE outline.docx
@@ -13,7 +13,6 @@
           <w:docPartUnique/>
         </w:docPartObj>
       </w:sdtPr>
-      <w:sdtEndPr/>
       <w:sdtContent>
         <w:p>
           <w:pPr>
@@ -206,7 +205,6 @@
                                       <w:dataBinding w:prefixMappings="xmlns:ns0='http://purl.org/dc/elements/1.1/' xmlns:ns1='http://schemas.openxmlformats.org/package/2006/metadata/core-properties' " w:xpath="/ns1:coreProperties[1]/ns0:title[1]" w:storeItemID="{6C3C8BC8-F283-45AE-878A-BAB7291924A1}"/>
                                       <w:text/>
                                     </w:sdtPr>
-                                    <w:sdtEndPr/>
                                     <w:sdtContent>
                                       <w:r>
                                         <w:rPr>
@@ -214,7 +212,25 @@
                                           <w:sz w:val="72"/>
                                           <w:szCs w:val="72"/>
                                         </w:rPr>
-                                        <w:t>WEDE5020:Website Project Outline</w:t>
+                                        <w:t>WEDE</w:t>
+                                      </w:r>
+                                      <w:proofErr w:type="gramStart"/>
+                                      <w:r>
+                                        <w:rPr>
+                                          <w:color w:val="FFFFFF" w:themeColor="background1"/>
+                                          <w:sz w:val="72"/>
+                                          <w:szCs w:val="72"/>
+                                        </w:rPr>
+                                        <w:t>5020:Website</w:t>
+                                      </w:r>
+                                      <w:proofErr w:type="gramEnd"/>
+                                      <w:r>
+                                        <w:rPr>
+                                          <w:color w:val="FFFFFF" w:themeColor="background1"/>
+                                          <w:sz w:val="72"/>
+                                          <w:szCs w:val="72"/>
+                                        </w:rPr>
+                                        <w:t xml:space="preserve"> Project Outline</w:t>
                                       </w:r>
                                     </w:sdtContent>
                                   </w:sdt>
@@ -385,7 +401,6 @@
                                 <w:dataBinding w:prefixMappings="xmlns:ns0='http://purl.org/dc/elements/1.1/' xmlns:ns1='http://schemas.openxmlformats.org/package/2006/metadata/core-properties' " w:xpath="/ns1:coreProperties[1]/ns0:title[1]" w:storeItemID="{6C3C8BC8-F283-45AE-878A-BAB7291924A1}"/>
                                 <w:text/>
                               </w:sdtPr>
-                              <w:sdtEndPr/>
                               <w:sdtContent>
                                 <w:r>
                                   <w:rPr>
@@ -393,7 +408,25 @@
                                     <w:sz w:val="72"/>
                                     <w:szCs w:val="72"/>
                                   </w:rPr>
-                                  <w:t>WEDE5020:Website Project Outline</w:t>
+                                  <w:t>WEDE</w:t>
+                                </w:r>
+                                <w:proofErr w:type="gramStart"/>
+                                <w:r>
+                                  <w:rPr>
+                                    <w:color w:val="FFFFFF" w:themeColor="background1"/>
+                                    <w:sz w:val="72"/>
+                                    <w:szCs w:val="72"/>
+                                  </w:rPr>
+                                  <w:t>5020:Website</w:t>
+                                </w:r>
+                                <w:proofErr w:type="gramEnd"/>
+                                <w:r>
+                                  <w:rPr>
+                                    <w:color w:val="FFFFFF" w:themeColor="background1"/>
+                                    <w:sz w:val="72"/>
+                                    <w:szCs w:val="72"/>
+                                  </w:rPr>
+                                  <w:t xml:space="preserve"> Project Outline</w:t>
                                 </w:r>
                               </w:sdtContent>
                             </w:sdt>
@@ -514,7 +547,6 @@
                                     <w:dataBinding w:prefixMappings="xmlns:ns0='http://schemas.microsoft.com/office/2006/coverPageProps' " w:xpath="/ns0:CoverPageProperties[1]/ns0:CompanyAddress[1]" w:storeItemID="{55AF091B-3C7A-41E3-B477-F2FDAA23CFDA}"/>
                                     <w:text/>
                                   </w:sdtPr>
-                                  <w:sdtEndPr/>
                                   <w:sdtContent>
                                     <w:r>
                                       <w:rPr>
@@ -596,7 +628,6 @@
                               <w:dataBinding w:prefixMappings="xmlns:ns0='http://schemas.microsoft.com/office/2006/coverPageProps' " w:xpath="/ns0:CoverPageProperties[1]/ns0:CompanyAddress[1]" w:storeItemID="{55AF091B-3C7A-41E3-B477-F2FDAA23CFDA}"/>
                               <w:text/>
                             </w:sdtPr>
-                            <w:sdtEndPr/>
                             <w:sdtContent>
                               <w:r>
                                 <w:rPr>
@@ -695,7 +726,6 @@
                                   <w:dataBinding w:prefixMappings="xmlns:ns0='http://purl.org/dc/elements/1.1/' xmlns:ns1='http://schemas.openxmlformats.org/package/2006/metadata/core-properties' " w:xpath="/ns1:coreProperties[1]/ns0:subject[1]" w:storeItemID="{6C3C8BC8-F283-45AE-878A-BAB7291924A1}"/>
                                   <w:text/>
                                 </w:sdtPr>
-                                <w:sdtEndPr/>
                                 <w:sdtContent>
                                   <w:p>
                                     <w:pPr>
@@ -734,7 +764,6 @@
                                   <w:dataBinding w:prefixMappings="xmlns:ns0='http://purl.org/dc/elements/1.1/' xmlns:ns1='http://schemas.openxmlformats.org/package/2006/metadata/core-properties' " w:xpath="/ns1:coreProperties[1]/ns0:creator[1]" w:storeItemID="{6C3C8BC8-F283-45AE-878A-BAB7291924A1}"/>
                                   <w:text/>
                                 </w:sdtPr>
-                                <w:sdtEndPr/>
                                 <w:sdtContent>
                                   <w:p>
                                     <w:pPr>
@@ -798,7 +827,6 @@
                             <w:dataBinding w:prefixMappings="xmlns:ns0='http://purl.org/dc/elements/1.1/' xmlns:ns1='http://schemas.openxmlformats.org/package/2006/metadata/core-properties' " w:xpath="/ns1:coreProperties[1]/ns0:subject[1]" w:storeItemID="{6C3C8BC8-F283-45AE-878A-BAB7291924A1}"/>
                             <w:text/>
                           </w:sdtPr>
-                          <w:sdtEndPr/>
                           <w:sdtContent>
                             <w:p>
                               <w:pPr>
@@ -837,7 +865,6 @@
                             <w:dataBinding w:prefixMappings="xmlns:ns0='http://purl.org/dc/elements/1.1/' xmlns:ns1='http://schemas.openxmlformats.org/package/2006/metadata/core-properties' " w:xpath="/ns1:coreProperties[1]/ns0:creator[1]" w:storeItemID="{6C3C8BC8-F283-45AE-878A-BAB7291924A1}"/>
                             <w:text/>
                           </w:sdtPr>
-                          <w:sdtEndPr/>
                           <w:sdtContent>
                             <w:p>
                               <w:pPr>
@@ -957,7 +984,6 @@
                                     <w:calendar w:val="gregorian"/>
                                   </w:date>
                                 </w:sdtPr>
-                                <w:sdtEndPr/>
                                 <w:sdtContent>
                                   <w:p>
                                     <w:pPr>
@@ -1025,7 +1051,6 @@
                               <w:calendar w:val="gregorian"/>
                             </w:date>
                           </w:sdtPr>
-                          <w:sdtEndPr/>
                           <w:sdtContent>
                             <w:p>
                               <w:pPr>
@@ -1117,7 +1142,7 @@
               <w:r>
                 <w:fldChar w:fldCharType="separate"/>
               </w:r>
-              <w:hyperlink w:anchor="_Toc236928226" w:history="1">
+              <w:hyperlink w:anchor="_Toc237511101" w:history="1">
                 <w:r>
                   <w:rPr>
                     <w:rStyle w:val="Hyperlink"/>
@@ -1145,7 +1170,7 @@
                     <w:noProof/>
                     <w:webHidden/>
                   </w:rPr>
-                  <w:instrText xml:space="preserve"> PAGEREF _Toc236928226 \h </w:instrText>
+                  <w:instrText xml:space="preserve"> PAGEREF _Toc237511101 \h </w:instrText>
                 </w:r>
                 <w:r>
                   <w:rPr>
@@ -1188,7 +1213,7 @@
                   <w:lang w:eastAsia="en-ZA"/>
                 </w:rPr>
               </w:pPr>
-              <w:hyperlink w:anchor="_Toc236928227" w:history="1">
+              <w:hyperlink w:anchor="_Toc237511102" w:history="1">
                 <w:r>
                   <w:rPr>
                     <w:rStyle w:val="Hyperlink"/>
@@ -1216,7 +1241,7 @@
                     <w:noProof/>
                     <w:webHidden/>
                   </w:rPr>
-                  <w:instrText xml:space="preserve"> PAGEREF _Toc236928227 \h </w:instrText>
+                  <w:instrText xml:space="preserve"> PAGEREF _Toc237511102 \h </w:instrText>
                 </w:r>
                 <w:r>
                   <w:rPr>
@@ -1259,7 +1284,7 @@
                   <w:lang w:eastAsia="en-ZA"/>
                 </w:rPr>
               </w:pPr>
-              <w:hyperlink w:anchor="_Toc236928228" w:history="1">
+              <w:hyperlink w:anchor="_Toc237511103" w:history="1">
                 <w:r>
                   <w:rPr>
                     <w:rStyle w:val="Hyperlink"/>
@@ -1287,7 +1312,7 @@
                     <w:noProof/>
                     <w:webHidden/>
                   </w:rPr>
-                  <w:instrText xml:space="preserve"> PAGEREF _Toc236928228 \h </w:instrText>
+                  <w:instrText xml:space="preserve"> PAGEREF _Toc237511103 \h </w:instrText>
                 </w:r>
                 <w:r>
                   <w:rPr>
@@ -1330,7 +1355,7 @@
                   <w:lang w:eastAsia="en-ZA"/>
                 </w:rPr>
               </w:pPr>
-              <w:hyperlink w:anchor="_Toc236928229" w:history="1">
+              <w:hyperlink w:anchor="_Toc237511104" w:history="1">
                 <w:r>
                   <w:rPr>
                     <w:rStyle w:val="Hyperlink"/>
@@ -1358,7 +1383,7 @@
                     <w:noProof/>
                     <w:webHidden/>
                   </w:rPr>
-                  <w:instrText xml:space="preserve"> PAGEREF _Toc236928229 \h </w:instrText>
+                  <w:instrText xml:space="preserve"> PAGEREF _Toc237511104 \h </w:instrText>
                 </w:r>
                 <w:r>
                   <w:rPr>
@@ -1401,7 +1426,7 @@
                   <w:lang w:eastAsia="en-ZA"/>
                 </w:rPr>
               </w:pPr>
-              <w:hyperlink w:anchor="_Toc236928230" w:history="1">
+              <w:hyperlink w:anchor="_Toc237511105" w:history="1">
                 <w:r>
                   <w:rPr>
                     <w:rStyle w:val="Hyperlink"/>
@@ -1429,7 +1454,7 @@
                     <w:noProof/>
                     <w:webHidden/>
                   </w:rPr>
-                  <w:instrText xml:space="preserve"> PAGEREF _Toc236928230 \h </w:instrText>
+                  <w:instrText xml:space="preserve"> PAGEREF _Toc237511105 \h </w:instrText>
                 </w:r>
                 <w:r>
                   <w:rPr>
@@ -1472,7 +1497,7 @@
                   <w:lang w:eastAsia="en-ZA"/>
                 </w:rPr>
               </w:pPr>
-              <w:hyperlink w:anchor="_Toc236928231" w:history="1">
+              <w:hyperlink w:anchor="_Toc237511106" w:history="1">
                 <w:r>
                   <w:rPr>
                     <w:rStyle w:val="Hyperlink"/>
@@ -1500,7 +1525,7 @@
                     <w:noProof/>
                     <w:webHidden/>
                   </w:rPr>
-                  <w:instrText xml:space="preserve"> PAGEREF _Toc236928231 \h </w:instrText>
+                  <w:instrText xml:space="preserve"> PAGEREF _Toc237511106 \h </w:instrText>
                 </w:r>
                 <w:r>
                   <w:rPr>
@@ -1543,7 +1568,7 @@
                   <w:lang w:eastAsia="en-ZA"/>
                 </w:rPr>
               </w:pPr>
-              <w:hyperlink w:anchor="_Toc236928232" w:history="1">
+              <w:hyperlink w:anchor="_Toc237511107" w:history="1">
                 <w:r>
                   <w:rPr>
                     <w:rStyle w:val="Hyperlink"/>
@@ -1571,7 +1596,7 @@
                     <w:noProof/>
                     <w:webHidden/>
                   </w:rPr>
-                  <w:instrText xml:space="preserve"> PAGEREF _Toc236928232 \h </w:instrText>
+                  <w:instrText xml:space="preserve"> PAGEREF _Toc237511107 \h </w:instrText>
                 </w:r>
                 <w:r>
                   <w:rPr>
@@ -1614,7 +1639,7 @@
                   <w:lang w:eastAsia="en-ZA"/>
                 </w:rPr>
               </w:pPr>
-              <w:hyperlink w:anchor="_Toc236928233" w:history="1">
+              <w:hyperlink w:anchor="_Toc237511108" w:history="1">
                 <w:r>
                   <w:rPr>
                     <w:rStyle w:val="Hyperlink"/>
@@ -1642,7 +1667,7 @@
                     <w:noProof/>
                     <w:webHidden/>
                   </w:rPr>
-                  <w:instrText xml:space="preserve"> PAGEREF _Toc236928233 \h </w:instrText>
+                  <w:instrText xml:space="preserve"> PAGEREF _Toc237511108 \h </w:instrText>
                 </w:r>
                 <w:r>
                   <w:rPr>
@@ -1685,7 +1710,7 @@
                   <w:lang w:eastAsia="en-ZA"/>
                 </w:rPr>
               </w:pPr>
-              <w:hyperlink w:anchor="_Toc236928234" w:history="1">
+              <w:hyperlink w:anchor="_Toc237511109" w:history="1">
                 <w:r>
                   <w:rPr>
                     <w:rStyle w:val="Hyperlink"/>
@@ -1713,7 +1738,7 @@
                     <w:noProof/>
                     <w:webHidden/>
                   </w:rPr>
-                  <w:instrText xml:space="preserve"> PAGEREF _Toc236928234 \h </w:instrText>
+                  <w:instrText xml:space="preserve"> PAGEREF _Toc237511109 \h </w:instrText>
                 </w:r>
                 <w:r>
                   <w:rPr>
@@ -1756,7 +1781,7 @@
                   <w:lang w:eastAsia="en-ZA"/>
                 </w:rPr>
               </w:pPr>
-              <w:hyperlink w:anchor="_Toc236928235" w:history="1">
+              <w:hyperlink w:anchor="_Toc237511110" w:history="1">
                 <w:r>
                   <w:rPr>
                     <w:rStyle w:val="Hyperlink"/>
@@ -1784,7 +1809,7 @@
                     <w:noProof/>
                     <w:webHidden/>
                   </w:rPr>
-                  <w:instrText xml:space="preserve"> PAGEREF _Toc236928235 \h </w:instrText>
+                  <w:instrText xml:space="preserve"> PAGEREF _Toc237511110 \h </w:instrText>
                 </w:r>
                 <w:r>
                   <w:rPr>
@@ -1827,7 +1852,7 @@
                   <w:lang w:eastAsia="en-ZA"/>
                 </w:rPr>
               </w:pPr>
-              <w:hyperlink w:anchor="_Toc236928236" w:history="1">
+              <w:hyperlink w:anchor="_Toc237511111" w:history="1">
                 <w:r>
                   <w:rPr>
                     <w:rStyle w:val="Hyperlink"/>
@@ -1855,7 +1880,7 @@
                     <w:noProof/>
                     <w:webHidden/>
                   </w:rPr>
-                  <w:instrText xml:space="preserve"> PAGEREF _Toc236928236 \h </w:instrText>
+                  <w:instrText xml:space="preserve"> PAGEREF _Toc237511111 \h </w:instrText>
                 </w:r>
                 <w:r>
                   <w:rPr>
@@ -1898,13 +1923,84 @@
                   <w:lang w:eastAsia="en-ZA"/>
                 </w:rPr>
               </w:pPr>
-              <w:hyperlink w:anchor="_Toc236928237" w:history="1">
+              <w:hyperlink w:anchor="_Toc237511112" w:history="1">
                 <w:r>
                   <w:rPr>
                     <w:rStyle w:val="Hyperlink"/>
                     <w:rFonts w:ascii="Arial" w:hAnsi="Arial" w:cs="Arial"/>
                     <w:noProof/>
                   </w:rPr>
+                  <w:t>Github repository</w:t>
+                </w:r>
+                <w:r>
+                  <w:rPr>
+                    <w:noProof/>
+                    <w:webHidden/>
+                  </w:rPr>
+                  <w:tab/>
+                </w:r>
+                <w:r>
+                  <w:rPr>
+                    <w:noProof/>
+                    <w:webHidden/>
+                  </w:rPr>
+                  <w:fldChar w:fldCharType="begin"/>
+                </w:r>
+                <w:r>
+                  <w:rPr>
+                    <w:noProof/>
+                    <w:webHidden/>
+                  </w:rPr>
+                  <w:instrText xml:space="preserve"> PAGEREF _Toc237511112 \h </w:instrText>
+                </w:r>
+                <w:r>
+                  <w:rPr>
+                    <w:noProof/>
+                    <w:webHidden/>
+                  </w:rPr>
+                </w:r>
+                <w:r>
+                  <w:rPr>
+                    <w:noProof/>
+                    <w:webHidden/>
+                  </w:rPr>
+                  <w:fldChar w:fldCharType="separate"/>
+                </w:r>
+                <w:r>
+                  <w:rPr>
+                    <w:noProof/>
+                    <w:webHidden/>
+                  </w:rPr>
+                  <w:t>8</w:t>
+                </w:r>
+                <w:r>
+                  <w:rPr>
+                    <w:noProof/>
+                    <w:webHidden/>
+                  </w:rPr>
+                  <w:fldChar w:fldCharType="end"/>
+                </w:r>
+              </w:hyperlink>
+            </w:p>
+            <w:p>
+              <w:pPr>
+                <w:pStyle w:val="TOC1"/>
+                <w:tabs>
+                  <w:tab w:val="right" w:leader="dot" w:pos="9016"/>
+                </w:tabs>
+                <w:rPr>
+                  <w:rFonts w:eastAsiaTheme="minorEastAsia"/>
+                  <w:noProof/>
+                  <w:lang w:eastAsia="en-ZA"/>
+                </w:rPr>
+              </w:pPr>
+              <w:hyperlink w:anchor="_Toc237511113" w:history="1">
+                <w:r>
+                  <w:rPr>
+                    <w:rStyle w:val="Hyperlink"/>
+                    <w:rFonts w:ascii="Arial" w:hAnsi="Arial" w:cs="Arial"/>
+                    <w:noProof/>
+                  </w:rPr>
                   <w:t>Expected Outcomes</w:t>
                 </w:r>
                 <w:r>
@@ -1926,7 +2022,7 @@
                     <w:noProof/>
                     <w:webHidden/>
                   </w:rPr>
-                  <w:instrText xml:space="preserve"> PAGEREF _Toc236928237 \h </w:instrText>
+                  <w:instrText xml:space="preserve"> PAGEREF _Toc237511113 \h </w:instrText>
                 </w:r>
                 <w:r>
                   <w:rPr>
@@ -2095,7 +2191,6 @@
           <w:rFonts w:ascii="Arial" w:hAnsi="Arial" w:cs="Arial"/>
           <w:u w:val="single"/>
         </w:rPr>
-        <w:lastRenderedPageBreak/>
         <w:t>Website Overview</w:t>
       </w:r>
     </w:p>
@@ -2184,7 +2279,7 @@
         </w:rPr>
       </w:pPr>
       <w:bookmarkStart w:id="0" w:name="_Toc236928143"/>
-      <w:bookmarkStart w:id="1" w:name="_Toc236928226"/>
+      <w:bookmarkStart w:id="1" w:name="_Toc237511101"/>
       <w:r>
         <w:rPr>
           <w:rFonts w:ascii="Arial" w:hAnsi="Arial" w:cs="Arial"/>
@@ -2225,7 +2320,7 @@
         </w:rPr>
       </w:pPr>
       <w:bookmarkStart w:id="2" w:name="_Toc236928144"/>
-      <w:bookmarkStart w:id="3" w:name="_Toc236928227"/>
+      <w:bookmarkStart w:id="3" w:name="_Toc237511102"/>
       <w:r>
         <w:rPr>
           <w:rFonts w:ascii="Arial" w:hAnsi="Arial" w:cs="Arial"/>
@@ -2362,6 +2457,7 @@
         <w:rPr>
           <w:rFonts w:ascii="Arial" w:hAnsi="Arial" w:cs="Arial"/>
         </w:rPr>
+        <w:lastRenderedPageBreak/>
         <w:t>Promote lifestyle events, weekly promotions, and special deals.</w:t>
       </w:r>
     </w:p>
@@ -2381,7 +2477,6 @@
         <w:rPr>
           <w:rFonts w:ascii="Arial" w:hAnsi="Arial" w:cs="Arial"/>
         </w:rPr>
-        <w:lastRenderedPageBreak/>
         <w:t>Give clients the option to use an online booking form to make reservations.</w:t>
       </w:r>
       <w:r>
@@ -2498,7 +2593,7 @@
         </w:rPr>
       </w:pPr>
       <w:bookmarkStart w:id="4" w:name="_Toc236928145"/>
-      <w:bookmarkStart w:id="5" w:name="_Toc236928228"/>
+      <w:bookmarkStart w:id="5" w:name="_Toc237511103"/>
       <w:r>
         <w:rPr>
           <w:rFonts w:ascii="Arial" w:hAnsi="Arial" w:cs="Arial"/>
@@ -2588,7 +2683,7 @@
         </w:rPr>
       </w:pPr>
       <w:bookmarkStart w:id="6" w:name="_Toc236928146"/>
-      <w:bookmarkStart w:id="7" w:name="_Toc236928229"/>
+      <w:bookmarkStart w:id="7" w:name="_Toc237511104"/>
       <w:r>
         <w:rPr>
           <w:rFonts w:ascii="Arial" w:hAnsi="Arial" w:cs="Arial"/>
@@ -2699,13 +2794,8 @@
         <w:rPr>
           <w:rFonts w:ascii="Arial" w:hAnsi="Arial" w:cs="Arial"/>
         </w:rPr>
+        <w:lastRenderedPageBreak/>
         <w:br/>
-      </w:r>
-      <w:r>
-        <w:rPr>
-          <w:rFonts w:ascii="Arial" w:hAnsi="Arial" w:cs="Arial"/>
-        </w:rPr>
-        <w:lastRenderedPageBreak/>
         <w:t>Auto Enthusiasts</w:t>
       </w:r>
       <w:r>
@@ -2828,7 +2918,7 @@
         </w:rPr>
       </w:pPr>
       <w:bookmarkStart w:id="8" w:name="_Toc236928147"/>
-      <w:bookmarkStart w:id="9" w:name="_Toc236928230"/>
+      <w:bookmarkStart w:id="9" w:name="_Toc237511105"/>
       <w:r>
         <w:rPr>
           <w:rFonts w:ascii="Arial" w:hAnsi="Arial" w:cs="Arial"/>
@@ -3138,7 +3228,7 @@
         </w:rPr>
       </w:pPr>
       <w:bookmarkStart w:id="10" w:name="_Toc236928148"/>
-      <w:bookmarkStart w:id="11" w:name="_Toc236928231"/>
+      <w:bookmarkStart w:id="11" w:name="_Toc237511106"/>
       <w:r>
         <w:rPr>
           <w:rFonts w:ascii="Arial" w:hAnsi="Arial" w:cs="Arial"/>
@@ -3190,6 +3280,7 @@
         <w:rPr>
           <w:rFonts w:ascii="Arial" w:eastAsia="MS Gothic" w:hAnsi="Arial" w:cs="Arial"/>
         </w:rPr>
+        <w:lastRenderedPageBreak/>
         <w:t>├</w:t>
       </w:r>
       <w:r>
@@ -3210,7 +3301,6 @@
         <w:rPr>
           <w:rFonts w:ascii="Arial" w:eastAsia="MS Gothic" w:hAnsi="Arial" w:cs="Arial"/>
         </w:rPr>
-        <w:lastRenderedPageBreak/>
         <w:t>├</w:t>
       </w:r>
       <w:r>
@@ -3347,7 +3437,7 @@
         </w:rPr>
       </w:pPr>
       <w:bookmarkStart w:id="12" w:name="_Toc236928149"/>
-      <w:bookmarkStart w:id="13" w:name="_Toc236928232"/>
+      <w:bookmarkStart w:id="13" w:name="_Toc237511107"/>
       <w:r>
         <w:rPr>
           <w:rFonts w:ascii="Arial" w:hAnsi="Arial" w:cs="Arial"/>
@@ -3627,7 +3717,7 @@
         </w:rPr>
       </w:pPr>
       <w:bookmarkStart w:id="14" w:name="_Toc236928150"/>
-      <w:bookmarkStart w:id="15" w:name="_Toc236928233"/>
+      <w:bookmarkStart w:id="15" w:name="_Toc237511108"/>
       <w:r>
         <w:rPr>
           <w:rFonts w:ascii="Arial" w:hAnsi="Arial" w:cs="Arial"/>
@@ -3837,7 +3927,7 @@
         </w:rPr>
       </w:pPr>
       <w:bookmarkStart w:id="16" w:name="_Toc236928151"/>
-      <w:bookmarkStart w:id="17" w:name="_Toc236928234"/>
+      <w:bookmarkStart w:id="17" w:name="_Toc237511109"/>
       <w:r>
         <w:rPr>
           <w:rFonts w:ascii="Arial" w:hAnsi="Arial" w:cs="Arial"/>
@@ -4016,7 +4106,7 @@
         </w:rPr>
       </w:pPr>
       <w:bookmarkStart w:id="18" w:name="_Toc236928152"/>
-      <w:bookmarkStart w:id="19" w:name="_Toc236928235"/>
+      <w:bookmarkStart w:id="19" w:name="_Toc237511110"/>
       <w:r>
         <w:rPr>
           <w:rFonts w:ascii="Arial" w:hAnsi="Arial" w:cs="Arial"/>
@@ -4343,7 +4433,7 @@
         </w:rPr>
       </w:pPr>
       <w:bookmarkStart w:id="20" w:name="_Toc236928153"/>
-      <w:bookmarkStart w:id="21" w:name="_Toc236928236"/>
+      <w:bookmarkStart w:id="21" w:name="_Toc237511111"/>
       <w:r>
         <w:rPr>
           <w:rFonts w:ascii="Arial" w:hAnsi="Arial" w:cs="Arial"/>
@@ -4501,6 +4591,90 @@
     <w:p>
       <w:pPr>
         <w:pStyle w:val="Heading1"/>
+        <w:rPr>
+          <w:rFonts w:ascii="Arial" w:hAnsi="Arial" w:cs="Arial"/>
+          <w:color w:val="auto"/>
+          <w:sz w:val="24"/>
+          <w:szCs w:val="24"/>
+        </w:rPr>
+      </w:pPr>
+      <w:bookmarkStart w:id="22" w:name="_Toc237511112"/>
+      <w:proofErr w:type="spellStart"/>
+      <w:r>
+        <w:rPr>
+          <w:rFonts w:ascii="Arial" w:hAnsi="Arial" w:cs="Arial"/>
+          <w:color w:val="auto"/>
+          <w:sz w:val="24"/>
+          <w:szCs w:val="24"/>
+        </w:rPr>
+        <w:t>G</w:t>
+      </w:r>
+      <w:r>
+        <w:rPr>
+          <w:rFonts w:ascii="Arial" w:hAnsi="Arial" w:cs="Arial"/>
+          <w:color w:val="auto"/>
+          <w:sz w:val="24"/>
+          <w:szCs w:val="24"/>
+        </w:rPr>
+        <w:t>ithub</w:t>
+      </w:r>
+      <w:proofErr w:type="spellEnd"/>
+      <w:r>
+        <w:rPr>
+          <w:rFonts w:ascii="Arial" w:hAnsi="Arial" w:cs="Arial"/>
+          <w:color w:val="auto"/>
+          <w:sz w:val="24"/>
+          <w:szCs w:val="24"/>
+        </w:rPr>
+        <w:t xml:space="preserve"> </w:t>
+      </w:r>
+      <w:r>
+        <w:rPr>
+          <w:rFonts w:ascii="Arial" w:hAnsi="Arial" w:cs="Arial"/>
+          <w:color w:val="auto"/>
+          <w:sz w:val="24"/>
+          <w:szCs w:val="24"/>
+        </w:rPr>
+        <w:t>repository</w:t>
+      </w:r>
+      <w:bookmarkEnd w:id="22"/>
+    </w:p>
+    <w:p>
+      <w:proofErr w:type="spellStart"/>
+      <w:proofErr w:type="gramStart"/>
+      <w:r>
+        <w:t>Username:KTselanngwe</w:t>
+      </w:r>
+      <w:proofErr w:type="spellEnd"/>
+      <w:proofErr w:type="gramEnd"/>
+      <w:r>
+        <w:t xml:space="preserve"> </w:t>
+      </w:r>
+    </w:p>
+    <w:p>
+      <w:proofErr w:type="gramStart"/>
+      <w:r>
+        <w:t>Email:ST10505914@rcconnect.edu.za</w:t>
+      </w:r>
+      <w:proofErr w:type="gramEnd"/>
+      <w:r>
+        <w:t xml:space="preserve"> </w:t>
+      </w:r>
+    </w:p>
+    <w:p>
+      <w:r>
+        <w:t>URL:</w:t>
+      </w:r>
+      <w:r>
+        <w:t xml:space="preserve"> </w:t>
+      </w:r>
+      <w:r>
+        <w:t>https://github.com/KTselanngwe/Kwa-Olga.git</w:t>
+      </w:r>
+    </w:p>
+    <w:p>
+      <w:pPr>
+        <w:pStyle w:val="Heading1"/>
         <w:spacing w:line="360" w:lineRule="auto"/>
         <w:rPr>
           <w:rFonts w:ascii="Arial" w:hAnsi="Arial" w:cs="Arial"/>
@@ -4510,8 +4684,8 @@
           <w:u w:val="single"/>
         </w:rPr>
       </w:pPr>
-      <w:bookmarkStart w:id="22" w:name="_Toc236928154"/>
-      <w:bookmarkStart w:id="23" w:name="_Toc236928237"/>
+      <w:bookmarkStart w:id="23" w:name="_Toc236928154"/>
+      <w:bookmarkStart w:id="24" w:name="_Toc237511113"/>
       <w:r>
         <w:rPr>
           <w:rFonts w:ascii="Arial" w:hAnsi="Arial" w:cs="Arial"/>
@@ -4522,8 +4696,8 @@
         </w:rPr>
         <w:t>Expected Outcomes</w:t>
       </w:r>
-      <w:bookmarkEnd w:id="22"/>
       <w:bookmarkEnd w:id="23"/>
+      <w:bookmarkEnd w:id="24"/>
     </w:p>
     <w:p>
       <w:pPr>
@@ -7382,7 +7556,6 @@
   <w:style w:type="character" w:default="1" w:styleId="DefaultParagraphFont">
     <w:name w:val="Default Paragraph Font"/>
     <w:uiPriority w:val="1"/>
-    <w:semiHidden/>
     <w:unhideWhenUsed/>
   </w:style>
   <w:style w:type="table" w:default="1" w:styleId="TableNormal">

</xml_diff>